<commit_message>
Initial Int for Assignment 2
Im using my old code as a base line and to fix mistake I made while doing it
</commit_message>
<xml_diff>
--- a/Class Exercise 3 - Functions/COSC1200.ClassExercise3.NumberTools.docx
+++ b/Class Exercise 3 - Functions/COSC1200.ClassExercise3.NumberTools.docx
@@ -1,6 +1,6 @@
 
 <file path=word/document.xml><?xml version="1.0" encoding="utf-8"?>
-<w:document xmlns:wpc="http://schemas.microsoft.com/office/word/2010/wordprocessingCanvas" xmlns:cx="http://schemas.microsoft.com/office/drawing/2014/chartex" xmlns:cx1="http://schemas.microsoft.com/office/drawing/2015/9/8/chartex" xmlns:cx2="http://schemas.microsoft.com/office/drawing/2015/10/21/chartex" xmlns:cx3="http://schemas.microsoft.com/office/drawing/2016/5/9/chartex" xmlns:cx4="http://schemas.microsoft.com/office/drawing/2016/5/10/chartex" xmlns:cx5="http://schemas.microsoft.com/office/drawing/2016/5/11/chartex" xmlns:cx6="http://schemas.microsoft.com/office/drawing/2016/5/12/chartex" xmlns:cx7="http://schemas.microsoft.com/office/drawing/2016/5/13/chartex" xmlns:cx8="http://schemas.microsoft.com/office/drawing/2016/5/14/chartex" xmlns:mc="http://schemas.openxmlformats.org/markup-compatibility/2006" xmlns:aink="http://schemas.microsoft.com/office/drawing/2016/ink" xmlns:am3d="http://schemas.microsoft.com/office/drawing/2017/model3d" xmlns:o="urn:schemas-microsoft-com:office:office" xmlns:r="http://schemas.openxmlformats.org/officeDocument/2006/relationships" xmlns:m="http://schemas.openxmlformats.org/officeDocument/2006/math" xmlns:v="urn:schemas-microsoft-com:vml" xmlns:wp14="http://schemas.microsoft.com/office/word/2010/wordprocessingDrawing" xmlns:wp="http://schemas.openxmlformats.org/drawingml/2006/wordprocessingDrawing" xmlns:w10="urn:schemas-microsoft-com:office:word" xmlns:w="http://schemas.openxmlformats.org/wordprocessingml/2006/main" xmlns:w14="http://schemas.microsoft.com/office/word/2010/wordml" xmlns:w15="http://schemas.microsoft.com/office/word/2012/wordml" xmlns:w16cid="http://schemas.microsoft.com/office/word/2016/wordml/cid" xmlns:w16se="http://schemas.microsoft.com/office/word/2015/wordml/symex" xmlns:wpg="http://schemas.microsoft.com/office/word/2010/wordprocessingGroup" xmlns:wpi="http://schemas.microsoft.com/office/word/2010/wordprocessingInk" xmlns:wne="http://schemas.microsoft.com/office/word/2006/wordml" xmlns:wps="http://schemas.microsoft.com/office/word/2010/wordprocessingShape" mc:Ignorable="w14 w15 w16se w16cid wp14">
+<w:document xmlns:wpc="http://schemas.microsoft.com/office/word/2010/wordprocessingCanvas" xmlns:cx="http://schemas.microsoft.com/office/drawing/2014/chartex" xmlns:cx1="http://schemas.microsoft.com/office/drawing/2015/9/8/chartex" xmlns:cx2="http://schemas.microsoft.com/office/drawing/2015/10/21/chartex" xmlns:cx3="http://schemas.microsoft.com/office/drawing/2016/5/9/chartex" xmlns:cx4="http://schemas.microsoft.com/office/drawing/2016/5/10/chartex" xmlns:cx5="http://schemas.microsoft.com/office/drawing/2016/5/11/chartex" xmlns:cx6="http://schemas.microsoft.com/office/drawing/2016/5/12/chartex" xmlns:cx7="http://schemas.microsoft.com/office/drawing/2016/5/13/chartex" xmlns:cx8="http://schemas.microsoft.com/office/drawing/2016/5/14/chartex" xmlns:mc="http://schemas.openxmlformats.org/markup-compatibility/2006" xmlns:aink="http://schemas.microsoft.com/office/drawing/2016/ink" xmlns:am3d="http://schemas.microsoft.com/office/drawing/2017/model3d" xmlns:o="urn:schemas-microsoft-com:office:office" xmlns:oel="http://schemas.microsoft.com/office/2019/extlst" xmlns:r="http://schemas.openxmlformats.org/officeDocument/2006/relationships" xmlns:m="http://schemas.openxmlformats.org/officeDocument/2006/math" xmlns:v="urn:schemas-microsoft-com:vml" xmlns:wp14="http://schemas.microsoft.com/office/word/2010/wordprocessingDrawing" xmlns:wp="http://schemas.openxmlformats.org/drawingml/2006/wordprocessingDrawing" xmlns:w10="urn:schemas-microsoft-com:office:word" xmlns:w="http://schemas.openxmlformats.org/wordprocessingml/2006/main" xmlns:w14="http://schemas.microsoft.com/office/word/2010/wordml" xmlns:w15="http://schemas.microsoft.com/office/word/2012/wordml" xmlns:w16cex="http://schemas.microsoft.com/office/word/2018/wordml/cex" xmlns:w16cid="http://schemas.microsoft.com/office/word/2016/wordml/cid" xmlns:w16="http://schemas.microsoft.com/office/word/2018/wordml" xmlns:w16du="http://schemas.microsoft.com/office/word/2023/wordml/word16du" xmlns:w16sdtdh="http://schemas.microsoft.com/office/word/2020/wordml/sdtdatahash" xmlns:w16sdtfl="http://schemas.microsoft.com/office/word/2024/wordml/sdtformatlock" xmlns:w16se="http://schemas.microsoft.com/office/word/2015/wordml/symex" xmlns:wpg="http://schemas.microsoft.com/office/word/2010/wordprocessingGroup" xmlns:wpi="http://schemas.microsoft.com/office/word/2010/wordprocessingInk" xmlns:wne="http://schemas.microsoft.com/office/word/2006/wordml" xmlns:wps="http://schemas.microsoft.com/office/word/2010/wordprocessingShape" mc:Ignorable="w14 w15 w16se w16cid w16 w16cex w16sdtdh w16sdtfl w16du wp14">
   <w:body>
     <w:p>
       <w:pPr>
@@ -414,25 +414,24 @@
           <w:numId w:val="17"/>
         </w:numPr>
         <w:spacing w:after="0" w:line="240" w:lineRule="auto"/>
+        <w:rPr>
+          <w:highlight w:val="yellow"/>
+        </w:rPr>
       </w:pPr>
       <w:proofErr w:type="spellStart"/>
       <w:proofErr w:type="gramStart"/>
       <w:r>
         <w:rPr>
           <w:rFonts w:ascii="Consolas" w:hAnsi="Consolas"/>
-        </w:rPr>
-        <w:t>is</w:t>
-      </w:r>
-      <w:r>
-        <w:rPr>
-          <w:rFonts w:ascii="Consolas" w:hAnsi="Consolas"/>
-        </w:rPr>
-        <w:t>Even</w:t>
+          <w:highlight w:val="yellow"/>
+        </w:rPr>
+        <w:t>isEven</w:t>
       </w:r>
       <w:proofErr w:type="spellEnd"/>
       <w:r>
         <w:rPr>
           <w:rFonts w:ascii="Consolas" w:hAnsi="Consolas"/>
+          <w:highlight w:val="yellow"/>
         </w:rPr>
         <w:t>(</w:t>
       </w:r>
@@ -440,34 +439,54 @@
       <w:r>
         <w:rPr>
           <w:rFonts w:ascii="Consolas" w:hAnsi="Consolas"/>
-        </w:rPr>
-        <w:t>int value</w:t>
-      </w:r>
-      <w:r>
-        <w:rPr>
-          <w:rFonts w:ascii="Consolas" w:hAnsi="Consolas"/>
-        </w:rPr>
-        <w:t>)</w:t>
-      </w:r>
-      <w:r>
+          <w:highlight w:val="yellow"/>
+        </w:rPr>
+        <w:t>int value)</w:t>
+      </w:r>
+      <w:r>
+        <w:rPr>
+          <w:highlight w:val="yellow"/>
+        </w:rPr>
         <w:t xml:space="preserve">: A function that will return </w:t>
       </w:r>
       <w:r>
         <w:rPr>
           <w:rFonts w:ascii="Consolas" w:hAnsi="Consolas"/>
+          <w:highlight w:val="yellow"/>
         </w:rPr>
         <w:t>true</w:t>
       </w:r>
       <w:r>
-        <w:t xml:space="preserve"> if its parameter is evenly divisible by 2, and return </w:t>
-      </w:r>
-      <w:r>
-        <w:rPr>
-          <w:rFonts w:ascii="Consolas" w:hAnsi="Consolas"/>
+        <w:rPr>
+          <w:highlight w:val="yellow"/>
+        </w:rPr>
+        <w:t xml:space="preserve"> if its parameter is evenly divisible by </w:t>
+      </w:r>
+      <w:proofErr w:type="gramStart"/>
+      <w:r>
+        <w:rPr>
+          <w:highlight w:val="yellow"/>
+        </w:rPr>
+        <w:t>2, and</w:t>
+      </w:r>
+      <w:proofErr w:type="gramEnd"/>
+      <w:r>
+        <w:rPr>
+          <w:highlight w:val="yellow"/>
+        </w:rPr>
+        <w:t xml:space="preserve"> return </w:t>
+      </w:r>
+      <w:r>
+        <w:rPr>
+          <w:rFonts w:ascii="Consolas" w:hAnsi="Consolas"/>
+          <w:highlight w:val="yellow"/>
         </w:rPr>
         <w:t>false</w:t>
       </w:r>
       <w:r>
+        <w:rPr>
+          <w:highlight w:val="yellow"/>
+        </w:rPr>
         <w:t xml:space="preserve"> otherwise.</w:t>
       </w:r>
     </w:p>
@@ -479,25 +498,24 @@
           <w:numId w:val="17"/>
         </w:numPr>
         <w:spacing w:after="0" w:line="240" w:lineRule="auto"/>
+        <w:rPr>
+          <w:highlight w:val="yellow"/>
+        </w:rPr>
       </w:pPr>
       <w:proofErr w:type="spellStart"/>
       <w:proofErr w:type="gramStart"/>
       <w:r>
         <w:rPr>
           <w:rFonts w:ascii="Consolas" w:hAnsi="Consolas"/>
-        </w:rPr>
-        <w:t>is</w:t>
-      </w:r>
-      <w:r>
-        <w:rPr>
-          <w:rFonts w:ascii="Consolas" w:hAnsi="Consolas"/>
-        </w:rPr>
-        <w:t>SingleDigit</w:t>
+          <w:highlight w:val="yellow"/>
+        </w:rPr>
+        <w:t>isSingleDigit</w:t>
       </w:r>
       <w:proofErr w:type="spellEnd"/>
       <w:r>
         <w:rPr>
           <w:rFonts w:ascii="Consolas" w:hAnsi="Consolas"/>
+          <w:highlight w:val="yellow"/>
         </w:rPr>
         <w:t>(</w:t>
       </w:r>
@@ -505,34 +523,54 @@
       <w:r>
         <w:rPr>
           <w:rFonts w:ascii="Consolas" w:hAnsi="Consolas"/>
-        </w:rPr>
-        <w:t>int value</w:t>
-      </w:r>
-      <w:r>
-        <w:rPr>
-          <w:rFonts w:ascii="Consolas" w:hAnsi="Consolas"/>
-        </w:rPr>
-        <w:t>)</w:t>
-      </w:r>
-      <w:r>
+          <w:highlight w:val="yellow"/>
+        </w:rPr>
+        <w:t>int value)</w:t>
+      </w:r>
+      <w:r>
+        <w:rPr>
+          <w:highlight w:val="yellow"/>
+        </w:rPr>
         <w:t xml:space="preserve">: A function that will return </w:t>
       </w:r>
       <w:r>
         <w:rPr>
           <w:rFonts w:ascii="Consolas" w:hAnsi="Consolas"/>
+          <w:highlight w:val="yellow"/>
         </w:rPr>
         <w:t>true</w:t>
       </w:r>
       <w:r>
-        <w:t xml:space="preserve"> if its parameter is between -9 and 9, and return </w:t>
-      </w:r>
-      <w:r>
-        <w:rPr>
-          <w:rFonts w:ascii="Consolas" w:hAnsi="Consolas"/>
+        <w:rPr>
+          <w:highlight w:val="yellow"/>
+        </w:rPr>
+        <w:t xml:space="preserve"> if its parameter is between -9 and </w:t>
+      </w:r>
+      <w:proofErr w:type="gramStart"/>
+      <w:r>
+        <w:rPr>
+          <w:highlight w:val="yellow"/>
+        </w:rPr>
+        <w:t>9, and</w:t>
+      </w:r>
+      <w:proofErr w:type="gramEnd"/>
+      <w:r>
+        <w:rPr>
+          <w:highlight w:val="yellow"/>
+        </w:rPr>
+        <w:t xml:space="preserve"> return </w:t>
+      </w:r>
+      <w:r>
+        <w:rPr>
+          <w:rFonts w:ascii="Consolas" w:hAnsi="Consolas"/>
+          <w:highlight w:val="yellow"/>
         </w:rPr>
         <w:t>false</w:t>
       </w:r>
       <w:r>
+        <w:rPr>
+          <w:highlight w:val="yellow"/>
+        </w:rPr>
         <w:t xml:space="preserve"> otherwise.</w:t>
       </w:r>
     </w:p>
@@ -592,10 +630,18 @@
         <w:t xml:space="preserve"> if its parameter is </w:t>
       </w:r>
       <w:r>
-        <w:t>in the Fibonacci sequence (i.e. 1, 1, 2, 3, 5, 8, 13, etc. – each term after the second is equal to the previous two terms added together)</w:t>
-      </w:r>
-      <w:r>
-        <w:t xml:space="preserve">, and return </w:t>
+        <w:t>in the Fibonacci sequence (i.e. 1, 1, 2, 3, 5, 8, 13, etc. – each term after the second is equal to the previous two terms added together</w:t>
+      </w:r>
+      <w:proofErr w:type="gramStart"/>
+      <w:r>
+        <w:t>)</w:t>
+      </w:r>
+      <w:r>
+        <w:t>, and</w:t>
+      </w:r>
+      <w:proofErr w:type="gramEnd"/>
+      <w:r>
+        <w:t xml:space="preserve"> return </w:t>
       </w:r>
       <w:r>
         <w:rPr>
@@ -622,25 +668,7 @@
         <w:rPr>
           <w:rFonts w:ascii="Consolas" w:hAnsi="Consolas"/>
         </w:rPr>
-        <w:t>is</w:t>
-      </w:r>
-      <w:r>
-        <w:rPr>
-          <w:rFonts w:ascii="Consolas" w:hAnsi="Consolas"/>
-        </w:rPr>
-        <w:t>P</w:t>
-      </w:r>
-      <w:r>
-        <w:rPr>
-          <w:rFonts w:ascii="Consolas" w:hAnsi="Consolas"/>
-        </w:rPr>
-        <w:t>o</w:t>
-      </w:r>
-      <w:r>
-        <w:rPr>
-          <w:rFonts w:ascii="Consolas" w:hAnsi="Consolas"/>
-        </w:rPr>
-        <w:t>werOfTwo</w:t>
+        <w:t>isPowerOfTwo</w:t>
       </w:r>
       <w:proofErr w:type="spellEnd"/>
       <w:r>
@@ -654,13 +682,7 @@
         <w:rPr>
           <w:rFonts w:ascii="Consolas" w:hAnsi="Consolas"/>
         </w:rPr>
-        <w:t>int value</w:t>
-      </w:r>
-      <w:r>
-        <w:rPr>
-          <w:rFonts w:ascii="Consolas" w:hAnsi="Consolas"/>
-        </w:rPr>
-        <w:t>)</w:t>
+        <w:t>int value)</w:t>
       </w:r>
       <w:r>
         <w:t xml:space="preserve">: A function that will return </w:t>
@@ -677,8 +699,13 @@
       <w:r>
         <w:t>…</w:t>
       </w:r>
-      <w:r>
-        <w:t xml:space="preserve">), and return </w:t>
+      <w:proofErr w:type="gramStart"/>
+      <w:r>
+        <w:t>), and</w:t>
+      </w:r>
+      <w:proofErr w:type="gramEnd"/>
+      <w:r>
+        <w:t xml:space="preserve"> return </w:t>
       </w:r>
       <w:r>
         <w:rPr>
@@ -695,19 +722,7 @@
         <w:rPr>
           <w:rFonts w:ascii="Consolas" w:hAnsi="Consolas"/>
         </w:rPr>
-        <w:t>is</w:t>
-      </w:r>
-      <w:r>
-        <w:rPr>
-          <w:rFonts w:ascii="Consolas" w:hAnsi="Consolas"/>
-        </w:rPr>
-        <w:t>P</w:t>
-      </w:r>
-      <w:r>
-        <w:rPr>
-          <w:rFonts w:ascii="Consolas" w:hAnsi="Consolas"/>
-        </w:rPr>
-        <w:t>ower</w:t>
+        <w:t>isPower</w:t>
       </w:r>
       <w:proofErr w:type="spellEnd"/>
       <w:r>
@@ -735,25 +750,24 @@
           <w:numId w:val="17"/>
         </w:numPr>
         <w:spacing w:after="0" w:line="240" w:lineRule="auto"/>
+        <w:rPr>
+          <w:highlight w:val="yellow"/>
+        </w:rPr>
       </w:pPr>
       <w:proofErr w:type="spellStart"/>
       <w:proofErr w:type="gramStart"/>
       <w:r>
         <w:rPr>
           <w:rFonts w:ascii="Consolas" w:hAnsi="Consolas"/>
-        </w:rPr>
-        <w:t>is</w:t>
-      </w:r>
-      <w:r>
-        <w:rPr>
-          <w:rFonts w:ascii="Consolas" w:hAnsi="Consolas"/>
-        </w:rPr>
-        <w:t>MultipleOfTen</w:t>
+          <w:highlight w:val="yellow"/>
+        </w:rPr>
+        <w:t>isMultipleOfTen</w:t>
       </w:r>
       <w:proofErr w:type="spellEnd"/>
       <w:r>
         <w:rPr>
           <w:rFonts w:ascii="Consolas" w:hAnsi="Consolas"/>
+          <w:highlight w:val="yellow"/>
         </w:rPr>
         <w:t>(</w:t>
       </w:r>
@@ -761,46 +775,54 @@
       <w:r>
         <w:rPr>
           <w:rFonts w:ascii="Consolas" w:hAnsi="Consolas"/>
-        </w:rPr>
-        <w:t>int value</w:t>
-      </w:r>
-      <w:r>
-        <w:rPr>
-          <w:rFonts w:ascii="Consolas" w:hAnsi="Consolas"/>
-        </w:rPr>
-        <w:t>)</w:t>
-      </w:r>
-      <w:r>
+          <w:highlight w:val="yellow"/>
+        </w:rPr>
+        <w:t>int value)</w:t>
+      </w:r>
+      <w:r>
+        <w:rPr>
+          <w:highlight w:val="yellow"/>
+        </w:rPr>
         <w:t xml:space="preserve">: A function that will return </w:t>
       </w:r>
       <w:r>
         <w:rPr>
           <w:rFonts w:ascii="Consolas" w:hAnsi="Consolas"/>
+          <w:highlight w:val="yellow"/>
         </w:rPr>
         <w:t>true</w:t>
       </w:r>
       <w:r>
-        <w:t xml:space="preserve"> if its parameter is a </w:t>
-      </w:r>
-      <w:r>
-        <w:t xml:space="preserve">multiple of 10 </w:t>
-      </w:r>
-      <w:r>
-        <w:t xml:space="preserve">(e.g. </w:t>
-      </w:r>
-      <w:r>
-        <w:t xml:space="preserve">10, 20, 40, </w:t>
-      </w:r>
-      <w:r>
-        <w:t xml:space="preserve">…), and return </w:t>
-      </w:r>
-      <w:r>
-        <w:rPr>
-          <w:rFonts w:ascii="Consolas" w:hAnsi="Consolas"/>
+        <w:rPr>
+          <w:highlight w:val="yellow"/>
+        </w:rPr>
+        <w:t xml:space="preserve"> if its parameter is a multiple of 10 (e.g. 10, 20, 40, …</w:t>
+      </w:r>
+      <w:proofErr w:type="gramStart"/>
+      <w:r>
+        <w:rPr>
+          <w:highlight w:val="yellow"/>
+        </w:rPr>
+        <w:t>), and</w:t>
+      </w:r>
+      <w:proofErr w:type="gramEnd"/>
+      <w:r>
+        <w:rPr>
+          <w:highlight w:val="yellow"/>
+        </w:rPr>
+        <w:t xml:space="preserve"> return </w:t>
+      </w:r>
+      <w:r>
+        <w:rPr>
+          <w:rFonts w:ascii="Consolas" w:hAnsi="Consolas"/>
+          <w:highlight w:val="yellow"/>
         </w:rPr>
         <w:t>false</w:t>
       </w:r>
       <w:r>
+        <w:rPr>
+          <w:highlight w:val="yellow"/>
+        </w:rPr>
         <w:t xml:space="preserve"> otherwise. (You could also genericize it into </w:t>
       </w:r>
       <w:proofErr w:type="spellStart"/>
@@ -808,19 +830,15 @@
       <w:r>
         <w:rPr>
           <w:rFonts w:ascii="Consolas" w:hAnsi="Consolas"/>
-        </w:rPr>
-        <w:t>is</w:t>
-      </w:r>
-      <w:r>
-        <w:rPr>
-          <w:rFonts w:ascii="Consolas" w:hAnsi="Consolas"/>
-        </w:rPr>
-        <w:t>Multiple</w:t>
+          <w:highlight w:val="yellow"/>
+        </w:rPr>
+        <w:t>isMultiple</w:t>
       </w:r>
       <w:proofErr w:type="spellEnd"/>
       <w:r>
         <w:rPr>
           <w:rFonts w:ascii="Consolas" w:hAnsi="Consolas"/>
+          <w:highlight w:val="yellow"/>
         </w:rPr>
         <w:t>(</w:t>
       </w:r>
@@ -828,17 +846,15 @@
       <w:r>
         <w:rPr>
           <w:rFonts w:ascii="Consolas" w:hAnsi="Consolas"/>
+          <w:highlight w:val="yellow"/>
         </w:rPr>
         <w:t>)</w:t>
       </w:r>
       <w:r>
-        <w:t xml:space="preserve"> to work with any </w:t>
-      </w:r>
-      <w:r>
-        <w:t>multiple</w:t>
-      </w:r>
-      <w:r>
-        <w:t>!)</w:t>
+        <w:rPr>
+          <w:highlight w:val="yellow"/>
+        </w:rPr>
+        <w:t xml:space="preserve"> to work with any multiple!)</w:t>
       </w:r>
     </w:p>
     <w:p>
@@ -897,10 +913,18 @@
         <w:t xml:space="preserve"> if its parameter is a prime</w:t>
       </w:r>
       <w:r>
-        <w:t xml:space="preserve"> (i.e. can’t be divided evenly by any number other than 1 and itself)</w:t>
-      </w:r>
-      <w:r>
-        <w:t xml:space="preserve">, and return </w:t>
+        <w:t xml:space="preserve"> (i.e. can’t be divided evenly by any number other than 1 and itself</w:t>
+      </w:r>
+      <w:proofErr w:type="gramStart"/>
+      <w:r>
+        <w:t>)</w:t>
+      </w:r>
+      <w:r>
+        <w:t>, and</w:t>
+      </w:r>
+      <w:proofErr w:type="gramEnd"/>
+      <w:r>
+        <w:t xml:space="preserve"> return </w:t>
       </w:r>
       <w:r>
         <w:rPr>
@@ -920,26 +944,25 @@
           <w:numId w:val="17"/>
         </w:numPr>
         <w:spacing w:after="0" w:line="240" w:lineRule="auto"/>
+        <w:rPr>
+          <w:highlight w:val="yellow"/>
+        </w:rPr>
       </w:pPr>
       <w:proofErr w:type="spellStart"/>
       <w:proofErr w:type="gramStart"/>
       <w:r>
         <w:rPr>
           <w:rFonts w:ascii="Consolas" w:hAnsi="Consolas"/>
+          <w:highlight w:val="yellow"/>
         </w:rPr>
         <w:lastRenderedPageBreak/>
-        <w:t>is</w:t>
-      </w:r>
-      <w:r>
-        <w:rPr>
-          <w:rFonts w:ascii="Consolas" w:hAnsi="Consolas"/>
-        </w:rPr>
-        <w:t>Square</w:t>
+        <w:t>isSquare</w:t>
       </w:r>
       <w:proofErr w:type="spellEnd"/>
       <w:r>
         <w:rPr>
           <w:rFonts w:ascii="Consolas" w:hAnsi="Consolas"/>
+          <w:highlight w:val="yellow"/>
         </w:rPr>
         <w:t>(</w:t>
       </w:r>
@@ -947,34 +970,54 @@
       <w:r>
         <w:rPr>
           <w:rFonts w:ascii="Consolas" w:hAnsi="Consolas"/>
-        </w:rPr>
-        <w:t>int value</w:t>
-      </w:r>
-      <w:r>
-        <w:rPr>
-          <w:rFonts w:ascii="Consolas" w:hAnsi="Consolas"/>
-        </w:rPr>
-        <w:t>)</w:t>
-      </w:r>
-      <w:r>
+          <w:highlight w:val="yellow"/>
+        </w:rPr>
+        <w:t>int value)</w:t>
+      </w:r>
+      <w:r>
+        <w:rPr>
+          <w:highlight w:val="yellow"/>
+        </w:rPr>
         <w:t xml:space="preserve">: A function that will return </w:t>
       </w:r>
       <w:r>
         <w:rPr>
           <w:rFonts w:ascii="Consolas" w:hAnsi="Consolas"/>
+          <w:highlight w:val="yellow"/>
         </w:rPr>
         <w:t>true</w:t>
       </w:r>
       <w:r>
-        <w:t xml:space="preserve"> if its parameter is a square number (e.g. the result of an integer squared, or has an integer square root), and return </w:t>
-      </w:r>
-      <w:r>
-        <w:rPr>
-          <w:rFonts w:ascii="Consolas" w:hAnsi="Consolas"/>
+        <w:rPr>
+          <w:highlight w:val="yellow"/>
+        </w:rPr>
+        <w:t xml:space="preserve"> if its parameter is a square number (e.g. the result of an integer squared, or has an integer square root</w:t>
+      </w:r>
+      <w:proofErr w:type="gramStart"/>
+      <w:r>
+        <w:rPr>
+          <w:highlight w:val="yellow"/>
+        </w:rPr>
+        <w:t>), and</w:t>
+      </w:r>
+      <w:proofErr w:type="gramEnd"/>
+      <w:r>
+        <w:rPr>
+          <w:highlight w:val="yellow"/>
+        </w:rPr>
+        <w:t xml:space="preserve"> return </w:t>
+      </w:r>
+      <w:r>
+        <w:rPr>
+          <w:rFonts w:ascii="Consolas" w:hAnsi="Consolas"/>
+          <w:highlight w:val="yellow"/>
         </w:rPr>
         <w:t>false</w:t>
       </w:r>
       <w:r>
+        <w:rPr>
+          <w:highlight w:val="yellow"/>
+        </w:rPr>
         <w:t xml:space="preserve"> otherwise.</w:t>
       </w:r>
     </w:p>
@@ -1031,13 +1074,15 @@
         <w:t>true</w:t>
       </w:r>
       <w:r>
-        <w:t xml:space="preserve"> if its parameter </w:t>
-      </w:r>
-      <w:r>
-        <w:t>has the same value when written backwards (e.g. 121, 1221, 25352…)</w:t>
-      </w:r>
-      <w:r>
-        <w:t xml:space="preserve">, and return </w:t>
+        <w:t xml:space="preserve"> if its parameter has the same value when written backwards (e.g. 121, 1221, 25352…</w:t>
+      </w:r>
+      <w:proofErr w:type="gramStart"/>
+      <w:r>
+        <w:t>), and</w:t>
+      </w:r>
+      <w:proofErr w:type="gramEnd"/>
+      <w:r>
+        <w:t xml:space="preserve"> return </w:t>
       </w:r>
       <w:r>
         <w:rPr>
@@ -1299,8 +1344,6 @@
       <w:r>
         <w:t>Starter code for this test file may be provided.</w:t>
       </w:r>
-      <w:bookmarkStart w:id="1" w:name="_GoBack"/>
-      <w:bookmarkEnd w:id="1"/>
     </w:p>
     <w:sectPr>
       <w:headerReference w:type="default" r:id="rId11"/>
@@ -1315,7 +1358,7 @@
 </file>
 
 <file path=word/endnotes.xml><?xml version="1.0" encoding="utf-8"?>
-<w:endnotes xmlns:wpc="http://schemas.microsoft.com/office/word/2010/wordprocessingCanvas" xmlns:cx="http://schemas.microsoft.com/office/drawing/2014/chartex" xmlns:cx1="http://schemas.microsoft.com/office/drawing/2015/9/8/chartex" xmlns:cx2="http://schemas.microsoft.com/office/drawing/2015/10/21/chartex" xmlns:cx3="http://schemas.microsoft.com/office/drawing/2016/5/9/chartex" xmlns:cx4="http://schemas.microsoft.com/office/drawing/2016/5/10/chartex" xmlns:cx5="http://schemas.microsoft.com/office/drawing/2016/5/11/chartex" xmlns:cx6="http://schemas.microsoft.com/office/drawing/2016/5/12/chartex" xmlns:cx7="http://schemas.microsoft.com/office/drawing/2016/5/13/chartex" xmlns:cx8="http://schemas.microsoft.com/office/drawing/2016/5/14/chartex" xmlns:mc="http://schemas.openxmlformats.org/markup-compatibility/2006" xmlns:aink="http://schemas.microsoft.com/office/drawing/2016/ink" xmlns:am3d="http://schemas.microsoft.com/office/drawing/2017/model3d" xmlns:o="urn:schemas-microsoft-com:office:office" xmlns:r="http://schemas.openxmlformats.org/officeDocument/2006/relationships" xmlns:m="http://schemas.openxmlformats.org/officeDocument/2006/math" xmlns:v="urn:schemas-microsoft-com:vml" xmlns:wp14="http://schemas.microsoft.com/office/word/2010/wordprocessingDrawing" xmlns:wp="http://schemas.openxmlformats.org/drawingml/2006/wordprocessingDrawing" xmlns:w10="urn:schemas-microsoft-com:office:word" xmlns:w="http://schemas.openxmlformats.org/wordprocessingml/2006/main" xmlns:w14="http://schemas.microsoft.com/office/word/2010/wordml" xmlns:w15="http://schemas.microsoft.com/office/word/2012/wordml" xmlns:w16cid="http://schemas.microsoft.com/office/word/2016/wordml/cid" xmlns:w16se="http://schemas.microsoft.com/office/word/2015/wordml/symex" xmlns:wpg="http://schemas.microsoft.com/office/word/2010/wordprocessingGroup" xmlns:wpi="http://schemas.microsoft.com/office/word/2010/wordprocessingInk" xmlns:wne="http://schemas.microsoft.com/office/word/2006/wordml" xmlns:wps="http://schemas.microsoft.com/office/word/2010/wordprocessingShape" mc:Ignorable="w14 w15 w16se w16cid wp14">
+<w:endnotes xmlns:wpc="http://schemas.microsoft.com/office/word/2010/wordprocessingCanvas" xmlns:cx="http://schemas.microsoft.com/office/drawing/2014/chartex" xmlns:cx1="http://schemas.microsoft.com/office/drawing/2015/9/8/chartex" xmlns:cx2="http://schemas.microsoft.com/office/drawing/2015/10/21/chartex" xmlns:cx3="http://schemas.microsoft.com/office/drawing/2016/5/9/chartex" xmlns:cx4="http://schemas.microsoft.com/office/drawing/2016/5/10/chartex" xmlns:cx5="http://schemas.microsoft.com/office/drawing/2016/5/11/chartex" xmlns:cx6="http://schemas.microsoft.com/office/drawing/2016/5/12/chartex" xmlns:cx7="http://schemas.microsoft.com/office/drawing/2016/5/13/chartex" xmlns:cx8="http://schemas.microsoft.com/office/drawing/2016/5/14/chartex" xmlns:mc="http://schemas.openxmlformats.org/markup-compatibility/2006" xmlns:aink="http://schemas.microsoft.com/office/drawing/2016/ink" xmlns:am3d="http://schemas.microsoft.com/office/drawing/2017/model3d" xmlns:o="urn:schemas-microsoft-com:office:office" xmlns:oel="http://schemas.microsoft.com/office/2019/extlst" xmlns:r="http://schemas.openxmlformats.org/officeDocument/2006/relationships" xmlns:m="http://schemas.openxmlformats.org/officeDocument/2006/math" xmlns:v="urn:schemas-microsoft-com:vml" xmlns:wp14="http://schemas.microsoft.com/office/word/2010/wordprocessingDrawing" xmlns:wp="http://schemas.openxmlformats.org/drawingml/2006/wordprocessingDrawing" xmlns:w10="urn:schemas-microsoft-com:office:word" xmlns:w="http://schemas.openxmlformats.org/wordprocessingml/2006/main" xmlns:w14="http://schemas.microsoft.com/office/word/2010/wordml" xmlns:w15="http://schemas.microsoft.com/office/word/2012/wordml" xmlns:w16cex="http://schemas.microsoft.com/office/word/2018/wordml/cex" xmlns:w16cid="http://schemas.microsoft.com/office/word/2016/wordml/cid" xmlns:w16="http://schemas.microsoft.com/office/word/2018/wordml" xmlns:w16du="http://schemas.microsoft.com/office/word/2023/wordml/word16du" xmlns:w16sdtdh="http://schemas.microsoft.com/office/word/2020/wordml/sdtdatahash" xmlns:w16sdtfl="http://schemas.microsoft.com/office/word/2024/wordml/sdtformatlock" xmlns:w16se="http://schemas.microsoft.com/office/word/2015/wordml/symex" xmlns:wpg="http://schemas.microsoft.com/office/word/2010/wordprocessingGroup" xmlns:wpi="http://schemas.microsoft.com/office/word/2010/wordprocessingInk" xmlns:wne="http://schemas.microsoft.com/office/word/2006/wordml" xmlns:wps="http://schemas.microsoft.com/office/word/2010/wordprocessingShape" mc:Ignorable="w14 w15 w16se w16cid w16 w16cex w16sdtdh w16sdtfl w16du wp14">
   <w:endnote w:type="separator" w:id="-1">
     <w:p>
       <w:pPr>
@@ -1340,7 +1383,7 @@
 </file>
 
 <file path=word/footer1.xml><?xml version="1.0" encoding="utf-8"?>
-<w:ftr xmlns:wpc="http://schemas.microsoft.com/office/word/2010/wordprocessingCanvas" xmlns:cx="http://schemas.microsoft.com/office/drawing/2014/chartex" xmlns:cx1="http://schemas.microsoft.com/office/drawing/2015/9/8/chartex" xmlns:cx2="http://schemas.microsoft.com/office/drawing/2015/10/21/chartex" xmlns:cx3="http://schemas.microsoft.com/office/drawing/2016/5/9/chartex" xmlns:cx4="http://schemas.microsoft.com/office/drawing/2016/5/10/chartex" xmlns:cx5="http://schemas.microsoft.com/office/drawing/2016/5/11/chartex" xmlns:cx6="http://schemas.microsoft.com/office/drawing/2016/5/12/chartex" xmlns:cx7="http://schemas.microsoft.com/office/drawing/2016/5/13/chartex" xmlns:cx8="http://schemas.microsoft.com/office/drawing/2016/5/14/chartex" xmlns:mc="http://schemas.openxmlformats.org/markup-compatibility/2006" xmlns:aink="http://schemas.microsoft.com/office/drawing/2016/ink" xmlns:am3d="http://schemas.microsoft.com/office/drawing/2017/model3d" xmlns:o="urn:schemas-microsoft-com:office:office" xmlns:r="http://schemas.openxmlformats.org/officeDocument/2006/relationships" xmlns:m="http://schemas.openxmlformats.org/officeDocument/2006/math" xmlns:v="urn:schemas-microsoft-com:vml" xmlns:wp14="http://schemas.microsoft.com/office/word/2010/wordprocessingDrawing" xmlns:wp="http://schemas.openxmlformats.org/drawingml/2006/wordprocessingDrawing" xmlns:w10="urn:schemas-microsoft-com:office:word" xmlns:w="http://schemas.openxmlformats.org/wordprocessingml/2006/main" xmlns:w14="http://schemas.microsoft.com/office/word/2010/wordml" xmlns:w15="http://schemas.microsoft.com/office/word/2012/wordml" xmlns:w16cid="http://schemas.microsoft.com/office/word/2016/wordml/cid" xmlns:w16se="http://schemas.microsoft.com/office/word/2015/wordml/symex" xmlns:wpg="http://schemas.microsoft.com/office/word/2010/wordprocessingGroup" xmlns:wpi="http://schemas.microsoft.com/office/word/2010/wordprocessingInk" xmlns:wne="http://schemas.microsoft.com/office/word/2006/wordml" xmlns:wps="http://schemas.microsoft.com/office/word/2010/wordprocessingShape" mc:Ignorable="w14 w15 w16se w16cid wp14">
+<w:ftr xmlns:wpc="http://schemas.microsoft.com/office/word/2010/wordprocessingCanvas" xmlns:cx="http://schemas.microsoft.com/office/drawing/2014/chartex" xmlns:cx1="http://schemas.microsoft.com/office/drawing/2015/9/8/chartex" xmlns:cx2="http://schemas.microsoft.com/office/drawing/2015/10/21/chartex" xmlns:cx3="http://schemas.microsoft.com/office/drawing/2016/5/9/chartex" xmlns:cx4="http://schemas.microsoft.com/office/drawing/2016/5/10/chartex" xmlns:cx5="http://schemas.microsoft.com/office/drawing/2016/5/11/chartex" xmlns:cx6="http://schemas.microsoft.com/office/drawing/2016/5/12/chartex" xmlns:cx7="http://schemas.microsoft.com/office/drawing/2016/5/13/chartex" xmlns:cx8="http://schemas.microsoft.com/office/drawing/2016/5/14/chartex" xmlns:mc="http://schemas.openxmlformats.org/markup-compatibility/2006" xmlns:aink="http://schemas.microsoft.com/office/drawing/2016/ink" xmlns:am3d="http://schemas.microsoft.com/office/drawing/2017/model3d" xmlns:o="urn:schemas-microsoft-com:office:office" xmlns:oel="http://schemas.microsoft.com/office/2019/extlst" xmlns:r="http://schemas.openxmlformats.org/officeDocument/2006/relationships" xmlns:m="http://schemas.openxmlformats.org/officeDocument/2006/math" xmlns:v="urn:schemas-microsoft-com:vml" xmlns:wp14="http://schemas.microsoft.com/office/word/2010/wordprocessingDrawing" xmlns:wp="http://schemas.openxmlformats.org/drawingml/2006/wordprocessingDrawing" xmlns:w10="urn:schemas-microsoft-com:office:word" xmlns:w="http://schemas.openxmlformats.org/wordprocessingml/2006/main" xmlns:w14="http://schemas.microsoft.com/office/word/2010/wordml" xmlns:w15="http://schemas.microsoft.com/office/word/2012/wordml" xmlns:w16cex="http://schemas.microsoft.com/office/word/2018/wordml/cex" xmlns:w16cid="http://schemas.microsoft.com/office/word/2016/wordml/cid" xmlns:w16="http://schemas.microsoft.com/office/word/2018/wordml" xmlns:w16du="http://schemas.microsoft.com/office/word/2023/wordml/word16du" xmlns:w16sdtdh="http://schemas.microsoft.com/office/word/2020/wordml/sdtdatahash" xmlns:w16sdtfl="http://schemas.microsoft.com/office/word/2024/wordml/sdtformatlock" xmlns:w16se="http://schemas.microsoft.com/office/word/2015/wordml/symex" xmlns:wpg="http://schemas.microsoft.com/office/word/2010/wordprocessingGroup" xmlns:wpi="http://schemas.microsoft.com/office/word/2010/wordprocessingInk" xmlns:wne="http://schemas.microsoft.com/office/word/2006/wordml" xmlns:wps="http://schemas.microsoft.com/office/word/2010/wordprocessingShape" mc:Ignorable="w14 w15 w16se w16cid w16 w16cex w16sdtdh w16sdtfl w16du wp14">
   <w:p>
     <w:pPr>
       <w:pStyle w:val="Footer"/>
@@ -1474,7 +1517,7 @@
 </file>
 
 <file path=word/footnotes.xml><?xml version="1.0" encoding="utf-8"?>
-<w:footnotes xmlns:wpc="http://schemas.microsoft.com/office/word/2010/wordprocessingCanvas" xmlns:cx="http://schemas.microsoft.com/office/drawing/2014/chartex" xmlns:cx1="http://schemas.microsoft.com/office/drawing/2015/9/8/chartex" xmlns:cx2="http://schemas.microsoft.com/office/drawing/2015/10/21/chartex" xmlns:cx3="http://schemas.microsoft.com/office/drawing/2016/5/9/chartex" xmlns:cx4="http://schemas.microsoft.com/office/drawing/2016/5/10/chartex" xmlns:cx5="http://schemas.microsoft.com/office/drawing/2016/5/11/chartex" xmlns:cx6="http://schemas.microsoft.com/office/drawing/2016/5/12/chartex" xmlns:cx7="http://schemas.microsoft.com/office/drawing/2016/5/13/chartex" xmlns:cx8="http://schemas.microsoft.com/office/drawing/2016/5/14/chartex" xmlns:mc="http://schemas.openxmlformats.org/markup-compatibility/2006" xmlns:aink="http://schemas.microsoft.com/office/drawing/2016/ink" xmlns:am3d="http://schemas.microsoft.com/office/drawing/2017/model3d" xmlns:o="urn:schemas-microsoft-com:office:office" xmlns:r="http://schemas.openxmlformats.org/officeDocument/2006/relationships" xmlns:m="http://schemas.openxmlformats.org/officeDocument/2006/math" xmlns:v="urn:schemas-microsoft-com:vml" xmlns:wp14="http://schemas.microsoft.com/office/word/2010/wordprocessingDrawing" xmlns:wp="http://schemas.openxmlformats.org/drawingml/2006/wordprocessingDrawing" xmlns:w10="urn:schemas-microsoft-com:office:word" xmlns:w="http://schemas.openxmlformats.org/wordprocessingml/2006/main" xmlns:w14="http://schemas.microsoft.com/office/word/2010/wordml" xmlns:w15="http://schemas.microsoft.com/office/word/2012/wordml" xmlns:w16cid="http://schemas.microsoft.com/office/word/2016/wordml/cid" xmlns:w16se="http://schemas.microsoft.com/office/word/2015/wordml/symex" xmlns:wpg="http://schemas.microsoft.com/office/word/2010/wordprocessingGroup" xmlns:wpi="http://schemas.microsoft.com/office/word/2010/wordprocessingInk" xmlns:wne="http://schemas.microsoft.com/office/word/2006/wordml" xmlns:wps="http://schemas.microsoft.com/office/word/2010/wordprocessingShape" mc:Ignorable="w14 w15 w16se w16cid wp14">
+<w:footnotes xmlns:wpc="http://schemas.microsoft.com/office/word/2010/wordprocessingCanvas" xmlns:cx="http://schemas.microsoft.com/office/drawing/2014/chartex" xmlns:cx1="http://schemas.microsoft.com/office/drawing/2015/9/8/chartex" xmlns:cx2="http://schemas.microsoft.com/office/drawing/2015/10/21/chartex" xmlns:cx3="http://schemas.microsoft.com/office/drawing/2016/5/9/chartex" xmlns:cx4="http://schemas.microsoft.com/office/drawing/2016/5/10/chartex" xmlns:cx5="http://schemas.microsoft.com/office/drawing/2016/5/11/chartex" xmlns:cx6="http://schemas.microsoft.com/office/drawing/2016/5/12/chartex" xmlns:cx7="http://schemas.microsoft.com/office/drawing/2016/5/13/chartex" xmlns:cx8="http://schemas.microsoft.com/office/drawing/2016/5/14/chartex" xmlns:mc="http://schemas.openxmlformats.org/markup-compatibility/2006" xmlns:aink="http://schemas.microsoft.com/office/drawing/2016/ink" xmlns:am3d="http://schemas.microsoft.com/office/drawing/2017/model3d" xmlns:o="urn:schemas-microsoft-com:office:office" xmlns:oel="http://schemas.microsoft.com/office/2019/extlst" xmlns:r="http://schemas.openxmlformats.org/officeDocument/2006/relationships" xmlns:m="http://schemas.openxmlformats.org/officeDocument/2006/math" xmlns:v="urn:schemas-microsoft-com:vml" xmlns:wp14="http://schemas.microsoft.com/office/word/2010/wordprocessingDrawing" xmlns:wp="http://schemas.openxmlformats.org/drawingml/2006/wordprocessingDrawing" xmlns:w10="urn:schemas-microsoft-com:office:word" xmlns:w="http://schemas.openxmlformats.org/wordprocessingml/2006/main" xmlns:w14="http://schemas.microsoft.com/office/word/2010/wordml" xmlns:w15="http://schemas.microsoft.com/office/word/2012/wordml" xmlns:w16cex="http://schemas.microsoft.com/office/word/2018/wordml/cex" xmlns:w16cid="http://schemas.microsoft.com/office/word/2016/wordml/cid" xmlns:w16="http://schemas.microsoft.com/office/word/2018/wordml" xmlns:w16du="http://schemas.microsoft.com/office/word/2023/wordml/word16du" xmlns:w16sdtdh="http://schemas.microsoft.com/office/word/2020/wordml/sdtdatahash" xmlns:w16sdtfl="http://schemas.microsoft.com/office/word/2024/wordml/sdtformatlock" xmlns:w16se="http://schemas.microsoft.com/office/word/2015/wordml/symex" xmlns:wpg="http://schemas.microsoft.com/office/word/2010/wordprocessingGroup" xmlns:wpi="http://schemas.microsoft.com/office/word/2010/wordprocessingInk" xmlns:wne="http://schemas.microsoft.com/office/word/2006/wordml" xmlns:wps="http://schemas.microsoft.com/office/word/2010/wordprocessingShape" mc:Ignorable="w14 w15 w16se w16cid w16 w16cex w16sdtdh w16sdtfl w16du wp14">
   <w:footnote w:type="separator" w:id="-1">
     <w:p>
       <w:pPr>
@@ -1499,7 +1542,7 @@
 </file>
 
 <file path=word/header1.xml><?xml version="1.0" encoding="utf-8"?>
-<w:hdr xmlns:wpc="http://schemas.microsoft.com/office/word/2010/wordprocessingCanvas" xmlns:cx="http://schemas.microsoft.com/office/drawing/2014/chartex" xmlns:cx1="http://schemas.microsoft.com/office/drawing/2015/9/8/chartex" xmlns:cx2="http://schemas.microsoft.com/office/drawing/2015/10/21/chartex" xmlns:cx3="http://schemas.microsoft.com/office/drawing/2016/5/9/chartex" xmlns:cx4="http://schemas.microsoft.com/office/drawing/2016/5/10/chartex" xmlns:cx5="http://schemas.microsoft.com/office/drawing/2016/5/11/chartex" xmlns:cx6="http://schemas.microsoft.com/office/drawing/2016/5/12/chartex" xmlns:cx7="http://schemas.microsoft.com/office/drawing/2016/5/13/chartex" xmlns:cx8="http://schemas.microsoft.com/office/drawing/2016/5/14/chartex" xmlns:mc="http://schemas.openxmlformats.org/markup-compatibility/2006" xmlns:aink="http://schemas.microsoft.com/office/drawing/2016/ink" xmlns:am3d="http://schemas.microsoft.com/office/drawing/2017/model3d" xmlns:o="urn:schemas-microsoft-com:office:office" xmlns:r="http://schemas.openxmlformats.org/officeDocument/2006/relationships" xmlns:m="http://schemas.openxmlformats.org/officeDocument/2006/math" xmlns:v="urn:schemas-microsoft-com:vml" xmlns:wp14="http://schemas.microsoft.com/office/word/2010/wordprocessingDrawing" xmlns:wp="http://schemas.openxmlformats.org/drawingml/2006/wordprocessingDrawing" xmlns:w10="urn:schemas-microsoft-com:office:word" xmlns:w="http://schemas.openxmlformats.org/wordprocessingml/2006/main" xmlns:w14="http://schemas.microsoft.com/office/word/2010/wordml" xmlns:w15="http://schemas.microsoft.com/office/word/2012/wordml" xmlns:w16cid="http://schemas.microsoft.com/office/word/2016/wordml/cid" xmlns:w16se="http://schemas.microsoft.com/office/word/2015/wordml/symex" xmlns:wpg="http://schemas.microsoft.com/office/word/2010/wordprocessingGroup" xmlns:wpi="http://schemas.microsoft.com/office/word/2010/wordprocessingInk" xmlns:wne="http://schemas.microsoft.com/office/word/2006/wordml" xmlns:wps="http://schemas.microsoft.com/office/word/2010/wordprocessingShape" mc:Ignorable="w14 w15 w16se w16cid wp14">
+<w:hdr xmlns:wpc="http://schemas.microsoft.com/office/word/2010/wordprocessingCanvas" xmlns:cx="http://schemas.microsoft.com/office/drawing/2014/chartex" xmlns:cx1="http://schemas.microsoft.com/office/drawing/2015/9/8/chartex" xmlns:cx2="http://schemas.microsoft.com/office/drawing/2015/10/21/chartex" xmlns:cx3="http://schemas.microsoft.com/office/drawing/2016/5/9/chartex" xmlns:cx4="http://schemas.microsoft.com/office/drawing/2016/5/10/chartex" xmlns:cx5="http://schemas.microsoft.com/office/drawing/2016/5/11/chartex" xmlns:cx6="http://schemas.microsoft.com/office/drawing/2016/5/12/chartex" xmlns:cx7="http://schemas.microsoft.com/office/drawing/2016/5/13/chartex" xmlns:cx8="http://schemas.microsoft.com/office/drawing/2016/5/14/chartex" xmlns:mc="http://schemas.openxmlformats.org/markup-compatibility/2006" xmlns:aink="http://schemas.microsoft.com/office/drawing/2016/ink" xmlns:am3d="http://schemas.microsoft.com/office/drawing/2017/model3d" xmlns:o="urn:schemas-microsoft-com:office:office" xmlns:oel="http://schemas.microsoft.com/office/2019/extlst" xmlns:r="http://schemas.openxmlformats.org/officeDocument/2006/relationships" xmlns:m="http://schemas.openxmlformats.org/officeDocument/2006/math" xmlns:v="urn:schemas-microsoft-com:vml" xmlns:wp14="http://schemas.microsoft.com/office/word/2010/wordprocessingDrawing" xmlns:wp="http://schemas.openxmlformats.org/drawingml/2006/wordprocessingDrawing" xmlns:w10="urn:schemas-microsoft-com:office:word" xmlns:w="http://schemas.openxmlformats.org/wordprocessingml/2006/main" xmlns:w14="http://schemas.microsoft.com/office/word/2010/wordml" xmlns:w15="http://schemas.microsoft.com/office/word/2012/wordml" xmlns:w16cex="http://schemas.microsoft.com/office/word/2018/wordml/cex" xmlns:w16cid="http://schemas.microsoft.com/office/word/2016/wordml/cid" xmlns:w16="http://schemas.microsoft.com/office/word/2018/wordml" xmlns:w16du="http://schemas.microsoft.com/office/word/2023/wordml/word16du" xmlns:w16sdtdh="http://schemas.microsoft.com/office/word/2020/wordml/sdtdatahash" xmlns:w16sdtfl="http://schemas.microsoft.com/office/word/2024/wordml/sdtformatlock" xmlns:w16se="http://schemas.microsoft.com/office/word/2015/wordml/symex" xmlns:wpg="http://schemas.microsoft.com/office/word/2010/wordprocessingGroup" xmlns:wpi="http://schemas.microsoft.com/office/word/2010/wordprocessingInk" xmlns:wne="http://schemas.microsoft.com/office/word/2006/wordml" xmlns:wps="http://schemas.microsoft.com/office/word/2010/wordprocessingShape" mc:Ignorable="w14 w15 w16se w16cid w16 w16cex w16sdtdh w16sdtfl w16du wp14">
   <w:p>
     <w:pPr>
       <w:pStyle w:val="Heading1"/>
@@ -1573,7 +1616,7 @@
 </file>
 
 <file path=word/numbering.xml><?xml version="1.0" encoding="utf-8"?>
-<w:numbering xmlns:wpc="http://schemas.microsoft.com/office/word/2010/wordprocessingCanvas" xmlns:cx="http://schemas.microsoft.com/office/drawing/2014/chartex" xmlns:cx1="http://schemas.microsoft.com/office/drawing/2015/9/8/chartex" xmlns:cx2="http://schemas.microsoft.com/office/drawing/2015/10/21/chartex" xmlns:cx3="http://schemas.microsoft.com/office/drawing/2016/5/9/chartex" xmlns:cx4="http://schemas.microsoft.com/office/drawing/2016/5/10/chartex" xmlns:cx5="http://schemas.microsoft.com/office/drawing/2016/5/11/chartex" xmlns:cx6="http://schemas.microsoft.com/office/drawing/2016/5/12/chartex" xmlns:cx7="http://schemas.microsoft.com/office/drawing/2016/5/13/chartex" xmlns:cx8="http://schemas.microsoft.com/office/drawing/2016/5/14/chartex" xmlns:mc="http://schemas.openxmlformats.org/markup-compatibility/2006" xmlns:aink="http://schemas.microsoft.com/office/drawing/2016/ink" xmlns:am3d="http://schemas.microsoft.com/office/drawing/2017/model3d" xmlns:o="urn:schemas-microsoft-com:office:office" xmlns:r="http://schemas.openxmlformats.org/officeDocument/2006/relationships" xmlns:m="http://schemas.openxmlformats.org/officeDocument/2006/math" xmlns:v="urn:schemas-microsoft-com:vml" xmlns:wp14="http://schemas.microsoft.com/office/word/2010/wordprocessingDrawing" xmlns:wp="http://schemas.openxmlformats.org/drawingml/2006/wordprocessingDrawing" xmlns:w10="urn:schemas-microsoft-com:office:word" xmlns:w="http://schemas.openxmlformats.org/wordprocessingml/2006/main" xmlns:w14="http://schemas.microsoft.com/office/word/2010/wordml" xmlns:w15="http://schemas.microsoft.com/office/word/2012/wordml" xmlns:w16cid="http://schemas.microsoft.com/office/word/2016/wordml/cid" xmlns:w16se="http://schemas.microsoft.com/office/word/2015/wordml/symex" xmlns:wpg="http://schemas.microsoft.com/office/word/2010/wordprocessingGroup" xmlns:wpi="http://schemas.microsoft.com/office/word/2010/wordprocessingInk" xmlns:wne="http://schemas.microsoft.com/office/word/2006/wordml" xmlns:wps="http://schemas.microsoft.com/office/word/2010/wordprocessingShape" mc:Ignorable="w14 w15 w16se w16cid wp14">
+<w:numbering xmlns:wpc="http://schemas.microsoft.com/office/word/2010/wordprocessingCanvas" xmlns:cx="http://schemas.microsoft.com/office/drawing/2014/chartex" xmlns:cx1="http://schemas.microsoft.com/office/drawing/2015/9/8/chartex" xmlns:cx2="http://schemas.microsoft.com/office/drawing/2015/10/21/chartex" xmlns:cx3="http://schemas.microsoft.com/office/drawing/2016/5/9/chartex" xmlns:cx4="http://schemas.microsoft.com/office/drawing/2016/5/10/chartex" xmlns:cx5="http://schemas.microsoft.com/office/drawing/2016/5/11/chartex" xmlns:cx6="http://schemas.microsoft.com/office/drawing/2016/5/12/chartex" xmlns:cx7="http://schemas.microsoft.com/office/drawing/2016/5/13/chartex" xmlns:cx8="http://schemas.microsoft.com/office/drawing/2016/5/14/chartex" xmlns:mc="http://schemas.openxmlformats.org/markup-compatibility/2006" xmlns:aink="http://schemas.microsoft.com/office/drawing/2016/ink" xmlns:am3d="http://schemas.microsoft.com/office/drawing/2017/model3d" xmlns:o="urn:schemas-microsoft-com:office:office" xmlns:oel="http://schemas.microsoft.com/office/2019/extlst" xmlns:r="http://schemas.openxmlformats.org/officeDocument/2006/relationships" xmlns:m="http://schemas.openxmlformats.org/officeDocument/2006/math" xmlns:v="urn:schemas-microsoft-com:vml" xmlns:wp14="http://schemas.microsoft.com/office/word/2010/wordprocessingDrawing" xmlns:wp="http://schemas.openxmlformats.org/drawingml/2006/wordprocessingDrawing" xmlns:w10="urn:schemas-microsoft-com:office:word" xmlns:w="http://schemas.openxmlformats.org/wordprocessingml/2006/main" xmlns:w14="http://schemas.microsoft.com/office/word/2010/wordml" xmlns:w15="http://schemas.microsoft.com/office/word/2012/wordml" xmlns:w16cex="http://schemas.microsoft.com/office/word/2018/wordml/cex" xmlns:w16cid="http://schemas.microsoft.com/office/word/2016/wordml/cid" xmlns:w16="http://schemas.microsoft.com/office/word/2018/wordml" xmlns:w16du="http://schemas.microsoft.com/office/word/2023/wordml/word16du" xmlns:w16sdtdh="http://schemas.microsoft.com/office/word/2020/wordml/sdtdatahash" xmlns:w16sdtfl="http://schemas.microsoft.com/office/word/2024/wordml/sdtformatlock" xmlns:w16se="http://schemas.microsoft.com/office/word/2015/wordml/symex" xmlns:wpg="http://schemas.microsoft.com/office/word/2010/wordprocessingGroup" xmlns:wpi="http://schemas.microsoft.com/office/word/2010/wordprocessingInk" xmlns:wne="http://schemas.microsoft.com/office/word/2006/wordml" xmlns:wps="http://schemas.microsoft.com/office/word/2010/wordprocessingShape" mc:Ignorable="w14 w15 w16se w16cid w16 w16cex w16sdtdh w16sdtfl w16du wp14">
   <w:abstractNum w:abstractNumId="0" w15:restartNumberingAfterBreak="0">
     <w:nsid w:val="01FB395C"/>
     <w:multiLevelType w:val="hybridMultilevel"/>
@@ -3571,68 +3614,68 @@
       </w:pPr>
     </w:lvl>
   </w:abstractNum>
-  <w:num w:numId="1">
+  <w:num w:numId="1" w16cid:durableId="825896185">
     <w:abstractNumId w:val="2"/>
   </w:num>
-  <w:num w:numId="2">
+  <w:num w:numId="2" w16cid:durableId="808060891">
     <w:abstractNumId w:val="8"/>
   </w:num>
-  <w:num w:numId="3">
+  <w:num w:numId="3" w16cid:durableId="1886866630">
     <w:abstractNumId w:val="12"/>
   </w:num>
-  <w:num w:numId="4">
+  <w:num w:numId="4" w16cid:durableId="1681812060">
     <w:abstractNumId w:val="11"/>
   </w:num>
-  <w:num w:numId="5">
+  <w:num w:numId="5" w16cid:durableId="733896709">
     <w:abstractNumId w:val="3"/>
   </w:num>
-  <w:num w:numId="6">
+  <w:num w:numId="6" w16cid:durableId="1280837418">
     <w:abstractNumId w:val="5"/>
   </w:num>
-  <w:num w:numId="7">
+  <w:num w:numId="7" w16cid:durableId="725568367">
     <w:abstractNumId w:val="14"/>
   </w:num>
-  <w:num w:numId="8">
+  <w:num w:numId="8" w16cid:durableId="1534996808">
     <w:abstractNumId w:val="0"/>
   </w:num>
-  <w:num w:numId="9">
+  <w:num w:numId="9" w16cid:durableId="1163667808">
     <w:abstractNumId w:val="1"/>
   </w:num>
-  <w:num w:numId="10">
+  <w:num w:numId="10" w16cid:durableId="1482849667">
     <w:abstractNumId w:val="7"/>
   </w:num>
-  <w:num w:numId="11">
+  <w:num w:numId="11" w16cid:durableId="1310404160">
     <w:abstractNumId w:val="9"/>
   </w:num>
-  <w:num w:numId="12">
+  <w:num w:numId="12" w16cid:durableId="1833763673">
     <w:abstractNumId w:val="15"/>
   </w:num>
-  <w:num w:numId="13">
+  <w:num w:numId="13" w16cid:durableId="570969664">
     <w:abstractNumId w:val="10"/>
   </w:num>
-  <w:num w:numId="14">
+  <w:num w:numId="14" w16cid:durableId="198010811">
     <w:abstractNumId w:val="6"/>
   </w:num>
-  <w:num w:numId="15">
+  <w:num w:numId="15" w16cid:durableId="774324972">
     <w:abstractNumId w:val="4"/>
   </w:num>
-  <w:num w:numId="16">
+  <w:num w:numId="16" w16cid:durableId="1696687427">
     <w:abstractNumId w:val="18"/>
   </w:num>
-  <w:num w:numId="17">
+  <w:num w:numId="17" w16cid:durableId="889070731">
     <w:abstractNumId w:val="13"/>
   </w:num>
-  <w:num w:numId="18">
+  <w:num w:numId="18" w16cid:durableId="1743602743">
     <w:abstractNumId w:val="16"/>
   </w:num>
-  <w:num w:numId="19">
+  <w:num w:numId="19" w16cid:durableId="492334120">
     <w:abstractNumId w:val="17"/>
   </w:num>
 </w:numbering>
 </file>
 
 <file path=word/styles.xml><?xml version="1.0" encoding="utf-8"?>
-<w:styles xmlns:mc="http://schemas.openxmlformats.org/markup-compatibility/2006" xmlns:r="http://schemas.openxmlformats.org/officeDocument/2006/relationships" xmlns:w="http://schemas.openxmlformats.org/wordprocessingml/2006/main" xmlns:w14="http://schemas.microsoft.com/office/word/2010/wordml" xmlns:w15="http://schemas.microsoft.com/office/word/2012/wordml" xmlns:w16cid="http://schemas.microsoft.com/office/word/2016/wordml/cid" xmlns:w16se="http://schemas.microsoft.com/office/word/2015/wordml/symex" mc:Ignorable="w14 w15 w16se w16cid">
+<w:styles xmlns:mc="http://schemas.openxmlformats.org/markup-compatibility/2006" xmlns:r="http://schemas.openxmlformats.org/officeDocument/2006/relationships" xmlns:w="http://schemas.openxmlformats.org/wordprocessingml/2006/main" xmlns:w14="http://schemas.microsoft.com/office/word/2010/wordml" xmlns:w15="http://schemas.microsoft.com/office/word/2012/wordml" xmlns:w16cex="http://schemas.microsoft.com/office/word/2018/wordml/cex" xmlns:w16cid="http://schemas.microsoft.com/office/word/2016/wordml/cid" xmlns:w16="http://schemas.microsoft.com/office/word/2018/wordml" xmlns:w16du="http://schemas.microsoft.com/office/word/2023/wordml/word16du" xmlns:w16sdtdh="http://schemas.microsoft.com/office/word/2020/wordml/sdtdatahash" xmlns:w16sdtfl="http://schemas.microsoft.com/office/word/2024/wordml/sdtformatlock" xmlns:w16se="http://schemas.microsoft.com/office/word/2015/wordml/symex" mc:Ignorable="w14 w15 w16se w16cid w16 w16cex w16sdtdh w16sdtfl w16du">
   <w:docDefaults>
     <w:rPrDefault>
       <w:rPr>
@@ -3648,7 +3691,7 @@
       </w:pPr>
     </w:pPrDefault>
   </w:docDefaults>
-  <w:latentStyles w:defLockedState="0" w:defUIPriority="99" w:defSemiHidden="0" w:defUnhideWhenUsed="0" w:defQFormat="0" w:count="375">
+  <w:latentStyles w:defLockedState="0" w:defUIPriority="99" w:defSemiHidden="0" w:defUnhideWhenUsed="0" w:defQFormat="0" w:count="376">
     <w:lsdException w:name="Normal" w:uiPriority="0" w:qFormat="1"/>
     <w:lsdException w:name="heading 1" w:uiPriority="9" w:qFormat="1"/>
     <w:lsdException w:name="heading 2" w:semiHidden="1" w:uiPriority="9" w:unhideWhenUsed="1" w:qFormat="1"/>
@@ -4024,6 +4067,7 @@
     <w:lsdException w:name="Smart Hyperlink" w:semiHidden="1" w:unhideWhenUsed="1"/>
     <w:lsdException w:name="Hashtag" w:semiHidden="1" w:unhideWhenUsed="1"/>
     <w:lsdException w:name="Unresolved Mention" w:semiHidden="1" w:unhideWhenUsed="1"/>
+    <w:lsdException w:name="Smart Link" w:semiHidden="1" w:unhideWhenUsed="1"/>
   </w:latentStyles>
   <w:style w:type="paragraph" w:default="1" w:styleId="Normal">
     <w:name w:val="Normal"/>
@@ -4694,12 +4738,9 @@
 </file>
 
 <file path=customXml/item1.xml><?xml version="1.0" encoding="utf-8"?>
-<?mso-contentType ?>
-<FormTemplates xmlns="http://schemas.microsoft.com/sharepoint/v3/contenttype/forms">
-  <Display>DocumentLibraryForm</Display>
-  <Edit>DocumentLibraryForm</Edit>
-  <New>DocumentLibraryForm</New>
-</FormTemplates>
+<p:properties xmlns:p="http://schemas.microsoft.com/office/2006/metadata/properties" xmlns:xsi="http://www.w3.org/2001/XMLSchema-instance" xmlns:pc="http://schemas.microsoft.com/office/infopath/2007/PartnerControls">
+  <documentManagement/>
+</p:properties>
 </file>
 
 <file path=customXml/item2.xml><?xml version="1.0" encoding="utf-8"?>
@@ -4849,9 +4890,12 @@
 </file>
 
 <file path=customXml/item3.xml><?xml version="1.0" encoding="utf-8"?>
-<p:properties xmlns:p="http://schemas.microsoft.com/office/2006/metadata/properties" xmlns:xsi="http://www.w3.org/2001/XMLSchema-instance" xmlns:pc="http://schemas.microsoft.com/office/infopath/2007/PartnerControls">
-  <documentManagement/>
-</p:properties>
+<?mso-contentType ?>
+<FormTemplates xmlns="http://schemas.microsoft.com/sharepoint/v3/contenttype/forms">
+  <Display>DocumentLibraryForm</Display>
+  <Edit>DocumentLibraryForm</Edit>
+  <New>DocumentLibraryForm</New>
+</FormTemplates>
 </file>
 
 <file path=customXml/item4.xml><?xml version="1.0" encoding="utf-8"?>
@@ -4859,9 +4903,10 @@
 </file>
 
 <file path=customXml/itemProps1.xml><?xml version="1.0" encoding="utf-8"?>
-<ds:datastoreItem xmlns:ds="http://schemas.openxmlformats.org/officeDocument/2006/customXml" ds:itemID="{248377AD-788A-4E3C-AD3E-283183A3F6DB}">
+<ds:datastoreItem xmlns:ds="http://schemas.openxmlformats.org/officeDocument/2006/customXml" ds:itemID="{EDDEDCD3-ACC0-4F06-B5BA-2787F62A049E}">
   <ds:schemaRefs>
-    <ds:schemaRef ds:uri="http://schemas.microsoft.com/sharepoint/v3/contenttype/forms"/>
+    <ds:schemaRef ds:uri="http://schemas.microsoft.com/office/2006/metadata/properties"/>
+    <ds:schemaRef ds:uri="http://schemas.microsoft.com/office/infopath/2007/PartnerControls"/>
   </ds:schemaRefs>
 </ds:datastoreItem>
 </file>
@@ -4885,10 +4930,9 @@
 </file>
 
 <file path=customXml/itemProps3.xml><?xml version="1.0" encoding="utf-8"?>
-<ds:datastoreItem xmlns:ds="http://schemas.openxmlformats.org/officeDocument/2006/customXml" ds:itemID="{EDDEDCD3-ACC0-4F06-B5BA-2787F62A049E}">
+<ds:datastoreItem xmlns:ds="http://schemas.openxmlformats.org/officeDocument/2006/customXml" ds:itemID="{248377AD-788A-4E3C-AD3E-283183A3F6DB}">
   <ds:schemaRefs>
-    <ds:schemaRef ds:uri="http://schemas.microsoft.com/office/2006/metadata/properties"/>
-    <ds:schemaRef ds:uri="http://schemas.microsoft.com/office/infopath/2007/PartnerControls"/>
+    <ds:schemaRef ds:uri="http://schemas.microsoft.com/sharepoint/v3/contenttype/forms"/>
   </ds:schemaRefs>
 </ds:datastoreItem>
 </file>

</xml_diff>